<commit_message>
upload extra visualizations for the experiments
</commit_message>
<xml_diff>
--- a/docs/self_assessment.docx
+++ b/docs/self_assessment.docx
@@ -223,8 +223,13 @@
             </w:tcMar>
           </w:tcPr>
           <w:p>
-            <w:r>
-              <w:t xml:space="preserve">AlphaToe: A Comparative Study on </w:t>
+            <w:proofErr w:type="spellStart"/>
+            <w:r>
+              <w:t>AlphaToe</w:t>
+            </w:r>
+            <w:proofErr w:type="spellEnd"/>
+            <w:r>
+              <w:t xml:space="preserve">: A Comparative Study on </w:t>
             </w:r>
             <w:r>
               <w:t xml:space="preserve">RL </w:t>
@@ -308,7 +313,15 @@
         <w:spacing w:before="60" w:after="60"/>
       </w:pPr>
       <w:r>
-        <w:t xml:space="preserve">Fill out this template in Word (or Google Docs → download as .docx), then upload the completed .docx to Gradescope alongside your repository link. Please do not convert to PDF — the editable .docx format is what </w:t>
+        <w:t xml:space="preserve">Fill out this template in Word (or Google Docs → download as .docx), then upload the completed .docx to </w:t>
+      </w:r>
+      <w:proofErr w:type="spellStart"/>
+      <w:r>
+        <w:t>Gradescope</w:t>
+      </w:r>
+      <w:proofErr w:type="spellEnd"/>
+      <w:r>
+        <w:t xml:space="preserve"> alongside your repository link. Please do not convert to PDF — the editable .docx format is what </w:t>
       </w:r>
       <w:r>
         <w:t>we</w:t>
@@ -369,8 +382,13 @@
         <w:spacing w:before="40" w:after="40"/>
       </w:pPr>
       <w:r>
-        <w:t>ablation study results in notebooks/experiments.ipynb</w:t>
+        <w:t>ablation study results in notebooks/</w:t>
       </w:r>
+      <w:proofErr w:type="spellStart"/>
+      <w:r>
+        <w:t>experiments.ipynb</w:t>
+      </w:r>
+      <w:proofErr w:type="spellEnd"/>
     </w:p>
     <w:p>
       <w:pPr>
@@ -878,7 +896,15 @@
               </w:rPr>
             </w:pPr>
             <w:r>
-              <w:t xml:space="preserve">Demonstrate the gumbel </w:t>
+              <w:t xml:space="preserve">Demonstrate the </w:t>
+            </w:r>
+            <w:proofErr w:type="spellStart"/>
+            <w:r>
+              <w:t>gumbel</w:t>
+            </w:r>
+            <w:proofErr w:type="spellEnd"/>
+            <w:r>
+              <w:t xml:space="preserve"> </w:t>
             </w:r>
             <w:r>
               <w:t xml:space="preserve">search performance in </w:t>
@@ -1081,15 +1107,6 @@
               <w:t>docs\PPO_VS_ALPHAGUMBEL.md</w:t>
             </w:r>
           </w:p>
-          <w:p>
-            <w:r>
-              <w:t xml:space="preserve">Graphs can be found in </w:t>
-            </w:r>
-            <w:r>
-              <w:t>docs\figures</w:t>
-            </w:r>
-          </w:p>
-          <w:p/>
         </w:tc>
       </w:tr>
       <w:tr>
@@ -1183,8 +1200,13 @@
             <w:r>
               <w:t xml:space="preserve">RL strength evaluation in </w:t>
             </w:r>
-            <w:r>
-              <w:t>src/agents/common/evaluation.py</w:t>
+            <w:proofErr w:type="spellStart"/>
+            <w:r>
+              <w:t>src</w:t>
+            </w:r>
+            <w:proofErr w:type="spellEnd"/>
+            <w:r>
+              <w:t>/agents/common/evaluation.py</w:t>
             </w:r>
             <w:r>
               <w:t>:</w:t>
@@ -1209,8 +1231,13 @@
             <w:r>
               <w:t xml:space="preserve"> computed in </w:t>
             </w:r>
-            <w:r>
-              <w:t>src/</w:t>
+            <w:proofErr w:type="spellStart"/>
+            <w:r>
+              <w:t>src</w:t>
+            </w:r>
+            <w:proofErr w:type="spellEnd"/>
+            <w:r>
+              <w:t>/</w:t>
             </w:r>
             <w:r>
               <w:t>utils/elo.py:</w:t>
@@ -1412,8 +1439,13 @@
             <w:r>
               <w:t xml:space="preserve">Web interface in </w:t>
             </w:r>
-            <w:r>
-              <w:t>src\web</w:t>
+            <w:proofErr w:type="spellStart"/>
+            <w:r>
+              <w:t>src</w:t>
+            </w:r>
+            <w:proofErr w:type="spellEnd"/>
+            <w:r>
+              <w:t>\web</w:t>
             </w:r>
           </w:p>
         </w:tc>
@@ -1518,11 +1550,16 @@
             <w:r>
               <w:t xml:space="preserve">based policy value network located in </w:t>
             </w:r>
+            <w:proofErr w:type="spellStart"/>
             <w:r>
               <w:t>s</w:t>
             </w:r>
             <w:r>
-              <w:t>rc/agents/common/network.py:65-112</w:t>
+              <w:t>rc</w:t>
+            </w:r>
+            <w:proofErr w:type="spellEnd"/>
+            <w:r>
+              <w:t>/agents/common/network.py:65-112</w:t>
             </w:r>
           </w:p>
         </w:tc>
@@ -1550,7 +1587,6 @@
               <w:spacing w:before="60" w:after="60"/>
             </w:pPr>
             <w:r>
-              <w:lastRenderedPageBreak/>
               <w:t>9</w:t>
             </w:r>
           </w:p>
@@ -1663,6 +1699,7 @@
               <w:spacing w:before="60" w:after="60"/>
             </w:pPr>
             <w:r>
+              <w:lastRenderedPageBreak/>
               <w:t>10</w:t>
             </w:r>
           </w:p>
@@ -1734,14 +1771,43 @@
             <w:r>
               <w:t xml:space="preserve"> in </w:t>
             </w:r>
-            <w:r>
-              <w:t xml:space="preserve">src/agents/ppo/trainer.py, </w:t>
+            <w:proofErr w:type="spellStart"/>
+            <w:r>
+              <w:t>src</w:t>
+            </w:r>
+            <w:proofErr w:type="spellEnd"/>
+            <w:r>
+              <w:t>/agents/</w:t>
+            </w:r>
+            <w:proofErr w:type="spellStart"/>
+            <w:r>
+              <w:t>ppo</w:t>
+            </w:r>
+            <w:proofErr w:type="spellEnd"/>
+            <w:r>
+              <w:t xml:space="preserve">/trainer.py, </w:t>
             </w:r>
             <w:r>
               <w:t>specifically</w:t>
             </w:r>
             <w:r>
-              <w:t xml:space="preserve"> compute_gae at lines 56-84 and collect_rollout at 169-236</w:t>
+              <w:t xml:space="preserve"> </w:t>
+            </w:r>
+            <w:proofErr w:type="spellStart"/>
+            <w:r>
+              <w:t>compute_gae</w:t>
+            </w:r>
+            <w:proofErr w:type="spellEnd"/>
+            <w:r>
+              <w:t xml:space="preserve"> at lines 56-84 and </w:t>
+            </w:r>
+            <w:proofErr w:type="spellStart"/>
+            <w:r>
+              <w:t>collect_rollout</w:t>
+            </w:r>
+            <w:proofErr w:type="spellEnd"/>
+            <w:r>
+              <w:t xml:space="preserve"> at 169-236</w:t>
             </w:r>
           </w:p>
         </w:tc>
@@ -1791,7 +1857,15 @@
           </w:tcPr>
           <w:p>
             <w:r>
-              <w:t>Defined and trained a custom neural network architecture (substantially designed by you, not a pretrained model) using PyTorch or similar framework</w:t>
+              <w:t xml:space="preserve">Defined and trained a custom neural network architecture (substantially designed by you, not a pretrained model) using </w:t>
+            </w:r>
+            <w:proofErr w:type="spellStart"/>
+            <w:r>
+              <w:t>PyTorch</w:t>
+            </w:r>
+            <w:proofErr w:type="spellEnd"/>
+            <w:r>
+              <w:t xml:space="preserve"> or similar framework</w:t>
             </w:r>
           </w:p>
         </w:tc>
@@ -1934,8 +2008,13 @@
             <w:r>
               <w:t xml:space="preserve">Random agent in </w:t>
             </w:r>
-            <w:r>
-              <w:t>src/agents/common/evaluation.py:36-40</w:t>
+            <w:proofErr w:type="spellStart"/>
+            <w:r>
+              <w:t>src</w:t>
+            </w:r>
+            <w:proofErr w:type="spellEnd"/>
+            <w:r>
+              <w:t>/agents/common/evaluation.py:36-40</w:t>
             </w:r>
           </w:p>
           <w:p>
@@ -1944,8 +2023,21 @@
             </w:r>
           </w:p>
           <w:p>
-            <w:r>
-              <w:t>src/agents/mcts/mcts_agent.py:68-119</w:t>
+            <w:proofErr w:type="spellStart"/>
+            <w:r>
+              <w:t>src</w:t>
+            </w:r>
+            <w:proofErr w:type="spellEnd"/>
+            <w:r>
+              <w:t>/agents/</w:t>
+            </w:r>
+            <w:proofErr w:type="spellStart"/>
+            <w:r>
+              <w:t>mcts</w:t>
+            </w:r>
+            <w:proofErr w:type="spellEnd"/>
+            <w:r>
+              <w:t>/mcts_agent.py:68-119</w:t>
             </w:r>
           </w:p>
         </w:tc>
@@ -2156,8 +2248,13 @@
             <w:r>
               <w:t xml:space="preserve">in </w:t>
             </w:r>
-            <w:r>
-              <w:t>src/scripts/pretrain_transformer.py</w:t>
+            <w:proofErr w:type="spellStart"/>
+            <w:r>
+              <w:t>src</w:t>
+            </w:r>
+            <w:proofErr w:type="spellEnd"/>
+            <w:r>
+              <w:t>/scripts/pretrain_transformer.py</w:t>
             </w:r>
             <w:r>
               <w:t>:384-385</w:t>
@@ -2173,8 +2270,21 @@
             <w:r>
               <w:t xml:space="preserve"> in </w:t>
             </w:r>
-            <w:r>
-              <w:t>src/agents/alphazero/transformer.py:50, 52</w:t>
+            <w:proofErr w:type="spellStart"/>
+            <w:r>
+              <w:t>src</w:t>
+            </w:r>
+            <w:proofErr w:type="spellEnd"/>
+            <w:r>
+              <w:t>/agents/</w:t>
+            </w:r>
+            <w:proofErr w:type="spellStart"/>
+            <w:r>
+              <w:t>alphazero</w:t>
+            </w:r>
+            <w:proofErr w:type="spellEnd"/>
+            <w:r>
+              <w:t>/transformer.py:50, 52</w:t>
             </w:r>
           </w:p>
           <w:p>
@@ -2187,28 +2297,42 @@
             <w:r>
               <w:t xml:space="preserve"> in </w:t>
             </w:r>
-            <w:r>
-              <w:t>src/agents/alphazero/transformer.py:102-105</w:t>
-            </w:r>
-          </w:p>
-          <w:p>
-            <w:r>
-              <w:t>B</w:t>
-            </w:r>
-            <w:r>
-              <w:t>est-by-val checkpoint selection (functions as early</w:t>
-            </w:r>
-            <w:r>
-              <w:t xml:space="preserve"> </w:t>
-            </w:r>
-            <w:r>
-              <w:t>stopping by selecting the best pre-overfit checkpoint)</w:t>
-            </w:r>
-            <w:r>
-              <w:t xml:space="preserve"> in </w:t>
-            </w:r>
-            <w:r>
-              <w:t>src/scripts/pretrain_transformer.py</w:t>
+            <w:proofErr w:type="spellStart"/>
+            <w:r>
+              <w:t>src</w:t>
+            </w:r>
+            <w:proofErr w:type="spellEnd"/>
+            <w:r>
+              <w:t>/agents/</w:t>
+            </w:r>
+            <w:proofErr w:type="spellStart"/>
+            <w:r>
+              <w:t>alphazero</w:t>
+            </w:r>
+            <w:proofErr w:type="spellEnd"/>
+            <w:r>
+              <w:t>/transformer.py:102-105</w:t>
+            </w:r>
+          </w:p>
+          <w:p>
+            <w:r>
+              <w:t>Best-by-</w:t>
+            </w:r>
+            <w:proofErr w:type="spellStart"/>
+            <w:r>
+              <w:t>val</w:t>
+            </w:r>
+            <w:proofErr w:type="spellEnd"/>
+            <w:r>
+              <w:t xml:space="preserve"> checkpoint selection (functions as early stopping by selecting the best pre-overfit checkpoint) in </w:t>
+            </w:r>
+            <w:proofErr w:type="spellStart"/>
+            <w:r>
+              <w:t>src</w:t>
+            </w:r>
+            <w:proofErr w:type="spellEnd"/>
+            <w:r>
+              <w:t>/scripts/pretrain_transformer.py</w:t>
             </w:r>
             <w:r>
               <w:t>:</w:t>
@@ -2316,9 +2440,11 @@
             <w:r>
               <w:t xml:space="preserve">method </w:t>
             </w:r>
+            <w:proofErr w:type="spellStart"/>
             <w:r>
               <w:t>make_splits</w:t>
             </w:r>
+            <w:proofErr w:type="spellEnd"/>
             <w:r>
               <w:t xml:space="preserve"> in </w:t>
             </w:r>
@@ -2331,13 +2457,13 @@
               <w:t xml:space="preserve">Documented in </w:t>
             </w:r>
             <w:r>
+              <w:t xml:space="preserve">section 3.2 of </w:t>
+            </w:r>
+            <w:r>
               <w:t>docs\PRETRAIN.md</w:t>
             </w:r>
             <w:r>
-              <w:t>:</w:t>
-            </w:r>
-            <w:r>
-              <w:t>38</w:t>
+              <w:t xml:space="preserve"> </w:t>
             </w:r>
           </w:p>
         </w:tc>
@@ -2357,7 +2483,6 @@
         <w:spacing w:before="60" w:after="60"/>
       </w:pPr>
       <w:r>
-        <w:lastRenderedPageBreak/>
         <w:t>Claim every item that applies.</w:t>
       </w:r>
     </w:p>
@@ -2367,6 +2492,7 @@
         <w:spacing w:before="240" w:after="120"/>
       </w:pPr>
       <w:r>
+        <w:lastRenderedPageBreak/>
         <w:t>Submission and Self-Assessment</w:t>
       </w:r>
     </w:p>
@@ -2977,7 +3103,15 @@
               <w:spacing w:before="60" w:after="60"/>
             </w:pPr>
             <w:r>
-              <w:t>requirements.txt or environment.yml present and accurate</w:t>
+              <w:t xml:space="preserve">requirements.txt or </w:t>
+            </w:r>
+            <w:proofErr w:type="spellStart"/>
+            <w:r>
+              <w:t>environment.yml</w:t>
+            </w:r>
+            <w:proofErr w:type="spellEnd"/>
+            <w:r>
+              <w:t xml:space="preserve"> present and accurate</w:t>
             </w:r>
           </w:p>
         </w:tc>
@@ -3730,7 +3864,6 @@
         <w:spacing w:before="240" w:after="120"/>
       </w:pPr>
       <w:r>
-        <w:lastRenderedPageBreak/>
         <w:t>Project Workshop Days (1 pt each)</w:t>
       </w:r>
     </w:p>
@@ -3790,6 +3923,7 @@
                 <w:b/>
                 <w:bCs/>
               </w:rPr>
+              <w:lastRenderedPageBreak/>
               <w:t>Claim</w:t>
             </w:r>
           </w:p>
@@ -5048,7 +5182,6 @@
               <w:rPr>
                 <w:rFonts w:ascii="Segoe UI Symbol" w:hAnsi="Segoe UI Symbol" w:cs="Segoe UI Symbol"/>
               </w:rPr>
-              <w:lastRenderedPageBreak/>
               <w:t>☒</w:t>
             </w:r>
           </w:p>
@@ -5135,6 +5268,7 @@
               <w:rPr>
                 <w:rFonts w:ascii="Segoe UI Symbol" w:hAnsi="Segoe UI Symbol" w:cs="Segoe UI Symbol"/>
               </w:rPr>
+              <w:lastRenderedPageBreak/>
               <w:t>☒</w:t>
             </w:r>
           </w:p>
@@ -5804,6 +5938,44 @@
     </w:sectPr>
   </w:body>
 </w:document>
+</file>
+
+<file path=word/endnotes.xml><?xml version="1.0" encoding="utf-8"?>
+<w:endnotes xmlns:wpc="http://schemas.microsoft.com/office/word/2010/wordprocessingCanvas" xmlns:cx="http://schemas.microsoft.com/office/drawing/2014/chartex" xmlns:cx1="http://schemas.microsoft.com/office/drawing/2015/9/8/chartex" xmlns:cx2="http://schemas.microsoft.com/office/drawing/2015/10/21/chartex" xmlns:cx3="http://schemas.microsoft.com/office/drawing/2016/5/9/chartex" xmlns:cx4="http://schemas.microsoft.com/office/drawing/2016/5/10/chartex" xmlns:cx5="http://schemas.microsoft.com/office/drawing/2016/5/11/chartex" xmlns:cx6="http://schemas.microsoft.com/office/drawing/2016/5/12/chartex" xmlns:cx7="http://schemas.microsoft.com/office/drawing/2016/5/13/chartex" xmlns:cx8="http://schemas.microsoft.com/office/drawing/2016/5/14/chartex" xmlns:mc="http://schemas.openxmlformats.org/markup-compatibility/2006" xmlns:aink="http://schemas.microsoft.com/office/drawing/2016/ink" xmlns:am3d="http://schemas.microsoft.com/office/drawing/2017/model3d" xmlns:o="urn:schemas-microsoft-com:office:office" xmlns:oel="http://schemas.microsoft.com/office/2019/extlst" xmlns:r="http://schemas.openxmlformats.org/officeDocument/2006/relationships" xmlns:m="http://schemas.openxmlformats.org/officeDocument/2006/math" xmlns:v="urn:schemas-microsoft-com:vml" xmlns:wp14="http://schemas.microsoft.com/office/word/2010/wordprocessingDrawing" xmlns:wp="http://schemas.openxmlformats.org/drawingml/2006/wordprocessingDrawing" xmlns:w10="urn:schemas-microsoft-com:office:word" xmlns:w="http://schemas.openxmlformats.org/wordprocessingml/2006/main" xmlns:w14="http://schemas.microsoft.com/office/word/2010/wordml" xmlns:w15="http://schemas.microsoft.com/office/word/2012/wordml" xmlns:w16cex="http://schemas.microsoft.com/office/word/2018/wordml/cex" xmlns:w16cid="http://schemas.microsoft.com/office/word/2016/wordml/cid" xmlns:w16="http://schemas.microsoft.com/office/word/2018/wordml" xmlns:w16du="http://schemas.microsoft.com/office/word/2023/wordml/word16du" xmlns:w16sdtdh="http://schemas.microsoft.com/office/word/2020/wordml/sdtdatahash" xmlns:w16sdtfl="http://schemas.microsoft.com/office/word/2024/wordml/sdtformatlock" xmlns:w16se="http://schemas.microsoft.com/office/word/2015/wordml/symex" xmlns:wpg="http://schemas.microsoft.com/office/word/2010/wordprocessingGroup" xmlns:wpi="http://schemas.microsoft.com/office/word/2010/wordprocessingInk" xmlns:wne="http://schemas.microsoft.com/office/word/2006/wordml" xmlns:wps="http://schemas.microsoft.com/office/word/2010/wordprocessingShape" mc:Ignorable="w14 w15 w16se w16cid w16 w16cex w16sdtdh w16sdtfl w16du wp14">
+  <w:endnote w:type="separator" w:id="-1">
+    <w:p>
+      <w:r>
+        <w:separator/>
+      </w:r>
+    </w:p>
+  </w:endnote>
+  <w:endnote w:type="continuationSeparator" w:id="0">
+    <w:p>
+      <w:r>
+        <w:continuationSeparator/>
+      </w:r>
+    </w:p>
+  </w:endnote>
+</w:endnotes>
+</file>
+
+<file path=word/footnotes.xml><?xml version="1.0" encoding="utf-8"?>
+<w:footnotes xmlns:wpc="http://schemas.microsoft.com/office/word/2010/wordprocessingCanvas" xmlns:cx="http://schemas.microsoft.com/office/drawing/2014/chartex" xmlns:cx1="http://schemas.microsoft.com/office/drawing/2015/9/8/chartex" xmlns:cx2="http://schemas.microsoft.com/office/drawing/2015/10/21/chartex" xmlns:cx3="http://schemas.microsoft.com/office/drawing/2016/5/9/chartex" xmlns:cx4="http://schemas.microsoft.com/office/drawing/2016/5/10/chartex" xmlns:cx5="http://schemas.microsoft.com/office/drawing/2016/5/11/chartex" xmlns:cx6="http://schemas.microsoft.com/office/drawing/2016/5/12/chartex" xmlns:cx7="http://schemas.microsoft.com/office/drawing/2016/5/13/chartex" xmlns:cx8="http://schemas.microsoft.com/office/drawing/2016/5/14/chartex" xmlns:mc="http://schemas.openxmlformats.org/markup-compatibility/2006" xmlns:aink="http://schemas.microsoft.com/office/drawing/2016/ink" xmlns:am3d="http://schemas.microsoft.com/office/drawing/2017/model3d" xmlns:o="urn:schemas-microsoft-com:office:office" xmlns:oel="http://schemas.microsoft.com/office/2019/extlst" xmlns:r="http://schemas.openxmlformats.org/officeDocument/2006/relationships" xmlns:m="http://schemas.openxmlformats.org/officeDocument/2006/math" xmlns:v="urn:schemas-microsoft-com:vml" xmlns:wp14="http://schemas.microsoft.com/office/word/2010/wordprocessingDrawing" xmlns:wp="http://schemas.openxmlformats.org/drawingml/2006/wordprocessingDrawing" xmlns:w10="urn:schemas-microsoft-com:office:word" xmlns:w="http://schemas.openxmlformats.org/wordprocessingml/2006/main" xmlns:w14="http://schemas.microsoft.com/office/word/2010/wordml" xmlns:w15="http://schemas.microsoft.com/office/word/2012/wordml" xmlns:w16cex="http://schemas.microsoft.com/office/word/2018/wordml/cex" xmlns:w16cid="http://schemas.microsoft.com/office/word/2016/wordml/cid" xmlns:w16="http://schemas.microsoft.com/office/word/2018/wordml" xmlns:w16du="http://schemas.microsoft.com/office/word/2023/wordml/word16du" xmlns:w16sdtdh="http://schemas.microsoft.com/office/word/2020/wordml/sdtdatahash" xmlns:w16sdtfl="http://schemas.microsoft.com/office/word/2024/wordml/sdtformatlock" xmlns:w16se="http://schemas.microsoft.com/office/word/2015/wordml/symex" xmlns:wpg="http://schemas.microsoft.com/office/word/2010/wordprocessingGroup" xmlns:wpi="http://schemas.microsoft.com/office/word/2010/wordprocessingInk" xmlns:wne="http://schemas.microsoft.com/office/word/2006/wordml" xmlns:wps="http://schemas.microsoft.com/office/word/2010/wordprocessingShape" mc:Ignorable="w14 w15 w16se w16cid w16 w16cex w16sdtdh w16sdtfl w16du wp14">
+  <w:footnote w:type="separator" w:id="-1">
+    <w:p>
+      <w:r>
+        <w:separator/>
+      </w:r>
+    </w:p>
+  </w:footnote>
+  <w:footnote w:type="continuationSeparator" w:id="0">
+    <w:p>
+      <w:r>
+        <w:continuationSeparator/>
+      </w:r>
+    </w:p>
+  </w:footnote>
+</w:footnotes>
 </file>
 
 <file path=word/numbering.xml><?xml version="1.0" encoding="utf-8"?>
@@ -6568,6 +6740,48 @@
       <w:szCs w:val="20"/>
     </w:rPr>
   </w:style>
+  <w:style w:type="paragraph" w:styleId="Header">
+    <w:name w:val="header"/>
+    <w:basedOn w:val="Normal"/>
+    <w:link w:val="HeaderChar"/>
+    <w:uiPriority w:val="99"/>
+    <w:unhideWhenUsed/>
+    <w:rsid w:val="008D3935"/>
+    <w:pPr>
+      <w:tabs>
+        <w:tab w:val="center" w:pos="4320"/>
+        <w:tab w:val="right" w:pos="8640"/>
+      </w:tabs>
+    </w:pPr>
+  </w:style>
+  <w:style w:type="character" w:customStyle="1" w:styleId="HeaderChar">
+    <w:name w:val="Header Char"/>
+    <w:basedOn w:val="DefaultParagraphFont"/>
+    <w:link w:val="Header"/>
+    <w:uiPriority w:val="99"/>
+    <w:rsid w:val="008D3935"/>
+  </w:style>
+  <w:style w:type="paragraph" w:styleId="Footer">
+    <w:name w:val="footer"/>
+    <w:basedOn w:val="Normal"/>
+    <w:link w:val="FooterChar"/>
+    <w:uiPriority w:val="99"/>
+    <w:unhideWhenUsed/>
+    <w:rsid w:val="008D3935"/>
+    <w:pPr>
+      <w:tabs>
+        <w:tab w:val="center" w:pos="4320"/>
+        <w:tab w:val="right" w:pos="8640"/>
+      </w:tabs>
+    </w:pPr>
+  </w:style>
+  <w:style w:type="character" w:customStyle="1" w:styleId="FooterChar">
+    <w:name w:val="Footer Char"/>
+    <w:basedOn w:val="DefaultParagraphFont"/>
+    <w:link w:val="Footer"/>
+    <w:uiPriority w:val="99"/>
+    <w:rsid w:val="008D3935"/>
+  </w:style>
 </w:styles>
 </file>
 

</xml_diff>